<commit_message>
docs: finalize clean professional submission documents (docx and md)
</commit_message>
<xml_diff>
--- a/ZERDE_Project_Submission.docx
+++ b/ZERDE_Project_Submission.docx
@@ -10,19 +10,19 @@
         <w:rPr>
           <w:b/>
           <w:color w:val="0969DA"/>
-          <w:sz w:val="28"/>
+          <w:sz w:val="26"/>
         </w:rPr>
         <w:t>ZERDE (ЗЕРДЕ) — Интеллектуальная Образовательная Платформа</w:t>
       </w:r>
     </w:p>
     <w:p>
       <w:pPr>
-        <w:spacing w:before="0" w:after="80" w:line="252" w:lineRule="auto"/>
+        <w:spacing w:before="0" w:after="60" w:line="252" w:lineRule="auto"/>
       </w:pPr>
       <w:r>
         <w:rPr>
           <w:color w:val="57606A"/>
-          <w:sz w:val="18"/>
+          <w:sz w:val="16"/>
         </w:rPr>
         <w:t>Хакатон: Future Minds Hackathon 2026 (г. Астана, NIS IB) | Трек: Трек 2 — Social Impact Challenge</w:t>
         <w:br/>
@@ -31,13 +31,13 @@
     </w:p>
     <w:p>
       <w:pPr>
-        <w:spacing w:before="100" w:after="40"/>
+        <w:spacing w:before="80" w:after="40"/>
       </w:pPr>
       <w:r>
         <w:rPr>
           <w:b/>
           <w:color w:val="1F2328"/>
-          <w:sz w:val="22"/>
+          <w:sz w:val="20"/>
         </w:rPr>
         <w:t>1. ССЫЛКИ И ДОСТУП ДЛЯ ЖЮРИ</w:t>
       </w:r>
@@ -50,13 +50,13 @@
       <w:r>
         <w:rPr>
           <w:b/>
-          <w:sz w:val="18"/>
+          <w:sz w:val="17"/>
         </w:rPr>
         <w:t xml:space="preserve">📊 Презентация (Pitch Deck PDF / Canva): </w:t>
       </w:r>
       <w:r>
         <w:rPr>
-          <w:sz w:val="18"/>
+          <w:sz w:val="17"/>
         </w:rPr>
         <w:t>[ВСТАВЬТЕ_ССЫЛКУ_НА_CANVA_ИЛИ_PDF]</w:t>
       </w:r>
@@ -69,13 +69,13 @@
       <w:r>
         <w:rPr>
           <w:b/>
-          <w:sz w:val="18"/>
+          <w:sz w:val="17"/>
         </w:rPr>
         <w:t xml:space="preserve">💻 Публичный репозиторий с кодом (GitHub): </w:t>
       </w:r>
       <w:r>
         <w:rPr>
-          <w:sz w:val="18"/>
+          <w:sz w:val="17"/>
         </w:rPr>
         <w:t>[ВСТАВЬТЕ_ССЫЛКУ_НА_GITHUB]</w:t>
       </w:r>
@@ -88,45 +88,45 @@
       <w:r>
         <w:rPr>
           <w:b/>
-          <w:sz w:val="18"/>
+          <w:sz w:val="17"/>
         </w:rPr>
         <w:t xml:space="preserve">🌐 Рабочий Live MVP (деплой): </w:t>
       </w:r>
       <w:r>
         <w:rPr>
-          <w:sz w:val="18"/>
+          <w:sz w:val="17"/>
         </w:rPr>
         <w:t>[ВСТАВЬТЕ_ССЫЛКУ_НА_ВЕБ_ДЕПЛОЙ]</w:t>
       </w:r>
     </w:p>
     <w:p>
       <w:pPr>
-        <w:spacing w:before="40" w:after="80" w:line="252" w:lineRule="auto"/>
+        <w:spacing w:before="20" w:after="60" w:line="252" w:lineRule="auto"/>
       </w:pPr>
       <w:r>
         <w:rPr>
           <w:b/>
-          <w:sz w:val="18"/>
+          <w:sz w:val="17"/>
         </w:rPr>
         <w:t xml:space="preserve">🔑 Тестовые аккаунты для проверки: </w:t>
       </w:r>
       <w:r>
         <w:rPr>
           <w:color w:val="0969DA"/>
-          <w:sz w:val="18"/>
+          <w:sz w:val="17"/>
         </w:rPr>
-        <w:t>Ученик: student.nis@nis.kz | Учитель: teacher.nis@nis.kz (Пароль: password123)</w:t>
+        <w:t>Ученик: student.nis@nis.kz | Учитель: teacher.nis@nis.kz (Пароль: Password2026!)</w:t>
       </w:r>
     </w:p>
     <w:p>
       <w:pPr>
-        <w:spacing w:before="100" w:after="40"/>
+        <w:spacing w:before="80" w:after="40"/>
       </w:pPr>
       <w:r>
         <w:rPr>
           <w:b/>
           <w:color w:val="1F2328"/>
-          <w:sz w:val="22"/>
+          <w:sz w:val="20"/>
         </w:rPr>
         <w:t>2. КРАТКОЕ ТЕХНИЧЕСКОЕ ОБЪЯСНЕНИЕ</w:t>
       </w:r>
@@ -139,15 +139,15 @@
       <w:r>
         <w:rPr>
           <w:b/>
-          <w:sz w:val="18"/>
+          <w:sz w:val="17"/>
         </w:rPr>
         <w:t xml:space="preserve">A. Использованный стек: </w:t>
       </w:r>
       <w:r>
         <w:rPr>
-          <w:sz w:val="18"/>
+          <w:sz w:val="17"/>
         </w:rPr>
-        <w:t>Frontend: React 18, TypeScript, Vite 5, Tailwind CSS, Radix UI, Framer Motion, KaTeX (быстрый локальный рендеринг математических формул), Canvas-Confetti. Backend: Node.js, Express, TypeScript, Better-SQLite3 (WAL-режим, 14 таблиц, транзакционная целостность), JWT-аутентификация и RBAC. AI: Google Gemini 2.5 Flash API (структурированные JSON-ответы через Zod). Математика: модель CDM DINA (диагностика микронавыков), XP Rating и SM-2 (интервальное повторение).</w:t>
+        <w:t>Frontend: React 18, TypeScript, Vite 5, Tailwind CSS, Radix UI, дизайн-системы GitHub Primer и shadcn/ui (открытая лицензия MIT), KaTeX (быстрый локальный рендеринг формул), Framer Motion, Canvas-Confetti. Backend: Node.js, Express, TypeScript, Better-SQLite3 (WAL-режим, 14 таблиц, транзакционная целостность), JWT-аутентификация и RBAC. AI: Google Gemini 2.5 Flash API (структурированные JSON-ответы через Zod). Математика: модель CDM DINA (диагностика микронавыков на сервере), XP Rating и SM-2.</w:t>
       </w:r>
     </w:p>
     <w:p>
@@ -158,15 +158,15 @@
       <w:r>
         <w:rPr>
           <w:b/>
-          <w:sz w:val="18"/>
+          <w:sz w:val="17"/>
         </w:rPr>
         <w:t xml:space="preserve">B. Реальная логика vs Mock Data: </w:t>
       </w:r>
       <w:r>
         <w:rPr>
-          <w:sz w:val="18"/>
+          <w:sz w:val="17"/>
         </w:rPr>
-        <w:t>Реальная логика: Сессии, пересчет XP и рангов, диалог наставника «Аға» с 3 развилками мысли (Thought-Forks), 2D-матрица дефицитов класса, триязычие (KZ/RU/EN), темная/светлая тема. Mock Data: Базовые организации (NIS IB, BIL), демонстрационный курс Алгебры и стартовая база вопросов.</w:t>
+        <w:t>Реальная логика: Сессии, пересчет XP и рангов, диалог наставника «Аға» с 3 развилками мысли (Thought-Forks), 2D-матрица дефицитов класса, триязычие (KZ/RU/EN), темная/светлая тема. Mock Data: Базовые организации (NIS IB, BIL), демонстрационный курс Алгебры 9 и стартовая база вопросов.</w:t>
       </w:r>
     </w:p>
     <w:p>
@@ -177,15 +177,15 @@
       <w:r>
         <w:rPr>
           <w:b/>
-          <w:sz w:val="18"/>
+          <w:sz w:val="17"/>
         </w:rPr>
         <w:t xml:space="preserve">C. Баланс разработки (ИИ vs Собственный код): </w:t>
       </w:r>
       <w:r>
         <w:rPr>
-          <w:sz w:val="18"/>
+          <w:sz w:val="17"/>
         </w:rPr>
-        <w:t>Написано разработчиком вручную: Проектирование UI/UX структуры, верстка на React и Tailwind CSS, клиентская маршрутизация, схема SQLite и начальные сиды, валидация форм, словари локализации (KZ/RU/EN), интеграция KaTeX. Использование ИИ: Генерация развилок мысли сократического ментора «Аға» (наведение на мысль при ошибках), анализ открытых решений в Silent Grader, генерация дистракторов для тестов.</w:t>
+        <w:t>Написано разработчиком вручную: Проектирование UI/UX структуры и компонентов на базе GitHub Primer и shadcn/ui (MIT), клиентская маршрутизация, схема SQLite и начальные сиды, валидация форм, словари локализации (KZ/RU/EN), интеграция KaTeX. Использование ИИ: Генерация развилок мысли сократического ментора «Аға» (пошаговое наведение на мысль при ошибках), анализ открытых решений в Silent Grader, генерация дистракторов для тестов.</w:t>
       </w:r>
     </w:p>
     <w:p>
@@ -196,13 +196,13 @@
       <w:r>
         <w:rPr>
           <w:b/>
-          <w:sz w:val="18"/>
+          <w:sz w:val="17"/>
         </w:rPr>
         <w:t xml:space="preserve">D. Сценарии проверки (User Flows): </w:t>
       </w:r>
       <w:r>
         <w:rPr>
-          <w:sz w:val="18"/>
+          <w:sz w:val="17"/>
         </w:rPr>
         <w:t>Ученик: Вход ➔ Просмотр «Фокуса дня» ➔ Запуск тренажера ➔ Ошибка ➔ 3 сократические развилки ➔ Выбор верного шага ➔ Начисление XP. Учитель: Вход ➔ Кабинет классов ➔ 2D-матрица успеваемости и дефицитов класса ➔ Добавление и редактирование материалов/заданий.</w:t>
       </w:r>
@@ -215,20 +215,20 @@
       <w:r>
         <w:rPr>
           <w:b/>
-          <w:sz w:val="18"/>
+          <w:sz w:val="17"/>
         </w:rPr>
         <w:t xml:space="preserve">E. Планы развития (Roadmap): </w:t>
       </w:r>
       <w:r>
         <w:rPr>
-          <w:sz w:val="18"/>
+          <w:sz w:val="17"/>
         </w:rPr>
-        <w:t>1) ZVDSL+ (Zerde Visual DSL) — векторный движок для химических связей, физических векторных схем и синтаксического разбора. 2) PWA &amp; Offline Mode — кеширование в IndexedDB для работы без интернета с фоновой синхронизацией. 3) Voice Socratic Mentor — голосовое общение с наставником «Аға» через WebRTC.</w:t>
+        <w:t>1) ZVDSL+ (Zerde Visual DSL) — специализированный векторный движок для химических связей, физических схем и синтаксического разбора. 2) PWA &amp; Offline Mode — кеширование в IndexedDB для работы без интернета с фоновой синхронизацией. 3) Voice Socratic Mentor — голосовой диалог с наставником «Аға» через WebRTC. 4) Teacher Co-Pilot Engine — расширение ассистента учителя на базе открытых стандартов (Open-Source / MIT).</w:t>
       </w:r>
     </w:p>
     <w:sectPr>
       <w:pgSz w:w="12240" w:h="15840"/>
-      <w:pgMar w:top="720" w:right="864" w:bottom="720" w:left="864" w:header="720" w:footer="720" w:gutter="0"/>
+      <w:pgMar w:top="576" w:right="792" w:bottom="576" w:left="792" w:header="720" w:footer="720" w:gutter="0"/>
       <w:cols w:space="720"/>
       <w:docGrid w:linePitch="360"/>
     </w:sectPr>
@@ -602,7 +602,7 @@
     <w:rPr>
       <w:rFonts w:ascii="Arial" w:hAnsi="Arial"/>
       <w:color w:val="1F2328"/>
-      <w:sz w:val="19"/>
+      <w:sz w:val="17"/>
     </w:rPr>
   </w:style>
   <w:style w:type="paragraph" w:styleId="Header">

</xml_diff>